<commit_message>
feat(pricing): redesign pricing management tables
- Separate Single-Class and Madrid pricing into table-first views
- Add per-table country filtering with "All Countries" as default
- Introduce row-level edit actions with restricted create/edit modes
- Ensure consistent reviewer permission checks across all views
</commit_message>
<xml_diff>
--- a/apps/api/internal/export/ABBC-国际商标报价模版.docx
+++ b/apps/api/internal/export/ABBC-国际商标报价模版.docx
@@ -11,6 +11,7 @@
           <w:rFonts w:ascii="宋体" w:cs="宋体" w:hAnsi="宋体" w:eastAsia="宋体"/>
           <w:sz w:val="32"/>
           <w:szCs w:val="32"/>
+          <w:lang w:val="zh-TW" w:eastAsia="zh-TW"/>
         </w:rPr>
       </w:pPr>
       <w:bookmarkStart w:name="OLE_LINK231" w:id="0"/>
@@ -110,7 +111,7 @@
           <w:rtl w:val="0"/>
           <w:lang w:val="zh-TW" w:eastAsia="zh-TW"/>
         </w:rPr>
-        <w:t>感谢贵司咨询商标向国外申请注册事宜，谢谢贵司的信任！</w:t>
+        <w:t>感谢贵司咨询商标向国外申请注册事宜！</w:t>
       </w:r>
     </w:p>
     <w:p>
@@ -375,148 +376,6 @@
           <w:lang w:val="zh-TW" w:eastAsia="zh-TW"/>
         </w:rPr>
         <w:t>、比亚迪、潮宏基、飞亚达、永丰源、雅芳婷、卡尔丹顿、玛丝菲尔、温氏股份、卡士酸奶、八马茶业、喜茶、喜之郎、百果园、怡宝、酒鬼酒、前海保险、万科、招商银行、名雕装饰、顺丰快递、邦德教育、阳光医院、威尼斯酒店等。我们提供包括商标、专利、版权等知识产权一体化解决方案。为客户服务、为客户解决知识产权问题，是我们企业建立的初衷，也是我们一直坚持，并将持续坚持的信念！</w:t>
-      </w:r>
-    </w:p>
-    <w:p>
-      <w:pPr>
-        <w:pStyle w:val="Normal.0"/>
-        <w:spacing w:line="360" w:lineRule="auto"/>
-        <w:ind w:firstLine="480"/>
-        <w:rPr>
-          <w:rFonts w:ascii="宋体" w:cs="宋体" w:hAnsi="宋体" w:eastAsia="宋体"/>
-          <w:sz w:val="24"/>
-          <w:szCs w:val="24"/>
-        </w:rPr>
-      </w:pPr>
-      <w:r>
-        <w:rPr>
-          <w:rFonts w:ascii="宋体" w:cs="宋体" w:hAnsi="宋体" w:eastAsia="宋体"/>
-          <w:sz w:val="24"/>
-          <w:szCs w:val="24"/>
-          <w:rtl w:val="0"/>
-          <w:lang w:val="zh-TW" w:eastAsia="zh-TW"/>
-        </w:rPr>
-        <w:t>浙江精英知识产权服务有限公司（</w:t>
-      </w:r>
-      <w:r>
-        <w:rPr>
-          <w:rFonts w:ascii="宋体" w:cs="宋体" w:hAnsi="宋体" w:eastAsia="宋体"/>
-          <w:sz w:val="24"/>
-          <w:szCs w:val="24"/>
-          <w:rtl w:val="0"/>
-          <w:lang w:val="en-US"/>
-        </w:rPr>
-        <w:t>“</w:t>
-      </w:r>
-      <w:r>
-        <w:rPr>
-          <w:rFonts w:ascii="宋体" w:cs="宋体" w:hAnsi="宋体" w:eastAsia="宋体"/>
-          <w:sz w:val="24"/>
-          <w:szCs w:val="24"/>
-          <w:rtl w:val="0"/>
-          <w:lang w:val="zh-TW" w:eastAsia="zh-TW"/>
-        </w:rPr>
-        <w:t>浙江精英</w:t>
-      </w:r>
-      <w:r>
-        <w:rPr>
-          <w:rFonts w:ascii="宋体" w:cs="宋体" w:hAnsi="宋体" w:eastAsia="宋体"/>
-          <w:sz w:val="24"/>
-          <w:szCs w:val="24"/>
-          <w:rtl w:val="0"/>
-          <w:lang w:val="en-US"/>
-        </w:rPr>
-        <w:t>”</w:t>
-      </w:r>
-      <w:r>
-        <w:rPr>
-          <w:rFonts w:ascii="宋体" w:cs="宋体" w:hAnsi="宋体" w:eastAsia="宋体"/>
-          <w:sz w:val="24"/>
-          <w:szCs w:val="24"/>
-          <w:rtl w:val="0"/>
-          <w:lang w:val="zh-TW" w:eastAsia="zh-TW"/>
-        </w:rPr>
-        <w:t>）是精英知识产权集团在华东区设立的子公司，拥有顾问团队及专业交付团队，旨在为华东区企业提供高端、专业的知识产权综合解决方案。浙江精英位于浙江省杭州市西湖区翠苑街道学院路</w:t>
-      </w:r>
-      <w:r>
-        <w:rPr>
-          <w:rFonts w:ascii="宋体" w:cs="宋体" w:hAnsi="宋体" w:eastAsia="宋体"/>
-          <w:sz w:val="24"/>
-          <w:szCs w:val="24"/>
-          <w:rtl w:val="0"/>
-          <w:lang w:val="en-US"/>
-        </w:rPr>
-        <w:t>77</w:t>
-      </w:r>
-      <w:r>
-        <w:rPr>
-          <w:rFonts w:ascii="宋体" w:cs="宋体" w:hAnsi="宋体" w:eastAsia="宋体"/>
-          <w:sz w:val="24"/>
-          <w:szCs w:val="24"/>
-          <w:rtl w:val="0"/>
-          <w:lang w:val="zh-TW" w:eastAsia="zh-TW"/>
-        </w:rPr>
-        <w:t>号黄龙国际中心</w:t>
-      </w:r>
-      <w:r>
-        <w:rPr>
-          <w:rFonts w:ascii="宋体" w:cs="宋体" w:hAnsi="宋体" w:eastAsia="宋体"/>
-          <w:sz w:val="24"/>
-          <w:szCs w:val="24"/>
-          <w:rtl w:val="0"/>
-          <w:lang w:val="en-US"/>
-        </w:rPr>
-        <w:t>G</w:t>
-      </w:r>
-      <w:r>
-        <w:rPr>
-          <w:rFonts w:ascii="宋体" w:cs="宋体" w:hAnsi="宋体" w:eastAsia="宋体"/>
-          <w:sz w:val="24"/>
-          <w:szCs w:val="24"/>
-          <w:rtl w:val="0"/>
-          <w:lang w:val="zh-TW" w:eastAsia="zh-TW"/>
-        </w:rPr>
-        <w:t>幢</w:t>
-      </w:r>
-      <w:r>
-        <w:rPr>
-          <w:rFonts w:ascii="宋体" w:cs="宋体" w:hAnsi="宋体" w:eastAsia="宋体"/>
-          <w:sz w:val="24"/>
-          <w:szCs w:val="24"/>
-          <w:rtl w:val="0"/>
-          <w:lang w:val="en-US"/>
-        </w:rPr>
-        <w:t>903</w:t>
-      </w:r>
-      <w:r>
-        <w:rPr>
-          <w:rFonts w:ascii="宋体" w:cs="宋体" w:hAnsi="宋体" w:eastAsia="宋体"/>
-          <w:sz w:val="24"/>
-          <w:szCs w:val="24"/>
-          <w:rtl w:val="0"/>
-          <w:lang w:val="zh-TW" w:eastAsia="zh-TW"/>
-        </w:rPr>
-        <w:t>室，联系电话为</w:t>
-      </w:r>
-      <w:r>
-        <w:rPr>
-          <w:rFonts w:ascii="宋体" w:cs="宋体" w:hAnsi="宋体" w:eastAsia="宋体"/>
-          <w:sz w:val="24"/>
-          <w:szCs w:val="24"/>
-          <w:rtl w:val="0"/>
-          <w:lang w:val="en-US"/>
-        </w:rPr>
-        <w:t>0571-85193619</w:t>
-      </w:r>
-      <w:r>
-        <w:rPr>
-          <w:rFonts w:ascii="宋体" w:cs="宋体" w:hAnsi="宋体" w:eastAsia="宋体"/>
-          <w:sz w:val="24"/>
-          <w:szCs w:val="24"/>
-          <w:rtl w:val="0"/>
-          <w:lang w:val="zh-TW" w:eastAsia="zh-TW"/>
-        </w:rPr>
-        <w:t>。</w:t>
       </w:r>
     </w:p>
     <w:p>
@@ -1030,7 +889,7 @@
       <w:tblPr>
         <w:tblW w:w="9969" w:type="dxa"/>
         <w:jc w:val="center"/>
-        <w:tblInd w:w="108" w:type="dxa"/>
+        <w:tblInd w:w="216" w:type="dxa"/>
         <w:tblBorders>
           <w:top w:val="single" w:color="ffffff" w:sz="8" w:space="0" w:shadow="0" w:frame="0"/>
           <w:left w:val="single" w:color="ffffff" w:sz="8" w:space="0" w:shadow="0" w:frame="0"/>
@@ -1054,7 +913,7 @@
           <w:shd w:val="clear" w:color="auto" w:fill="ced7e7"/>
         </w:tblPrEx>
         <w:trPr>
-          <w:trHeight w:val="478" w:hRule="atLeast"/>
+          <w:trHeight w:val="488" w:hRule="atLeast"/>
         </w:trPr>
         <w:tc>
           <w:tcPr>
@@ -1188,7 +1047,7 @@
         </w:tc>
         <w:tc>
           <w:tcPr>
-            <w:tcW w:type="dxa" w:w="2580"/>
+            <w:tcW w:type="dxa" w:w="2581"/>
             <w:tcBorders>
               <w:top w:val="single" w:color="000000" w:sz="4" w:space="0" w:shadow="0" w:frame="0"/>
               <w:left w:val="single" w:color="000000" w:sz="4" w:space="0" w:shadow="0" w:frame="0"/>
@@ -1264,7 +1123,7 @@
           <w:shd w:val="clear" w:color="auto" w:fill="ced7e7"/>
         </w:tblPrEx>
         <w:trPr>
-          <w:trHeight w:val="310" w:hRule="atLeast"/>
+          <w:trHeight w:val="320" w:hRule="atLeast"/>
         </w:trPr>
         <w:tc>
           <w:tcPr>
@@ -1382,7 +1241,7 @@
         </w:tc>
         <w:tc>
           <w:tcPr>
-            <w:tcW w:type="dxa" w:w="2580"/>
+            <w:tcW w:type="dxa" w:w="2581"/>
             <w:tcBorders>
               <w:top w:val="single" w:color="000000" w:sz="4" w:space="0" w:shadow="0" w:frame="0"/>
               <w:left w:val="single" w:color="000000" w:sz="4" w:space="0" w:shadow="0" w:frame="0"/>
@@ -1441,7 +1300,7 @@
           <w:shd w:val="clear" w:color="auto" w:fill="ced7e7"/>
         </w:tblPrEx>
         <w:trPr>
-          <w:trHeight w:val="310" w:hRule="atLeast"/>
+          <w:trHeight w:val="320" w:hRule="atLeast"/>
         </w:trPr>
         <w:tc>
           <w:tcPr>
@@ -1550,7 +1409,7 @@
         </w:tc>
         <w:tc>
           <w:tcPr>
-            <w:tcW w:type="dxa" w:w="2580"/>
+            <w:tcW w:type="dxa" w:w="2581"/>
             <w:tcBorders>
               <w:top w:val="single" w:color="000000" w:sz="4" w:space="0" w:shadow="0" w:frame="0"/>
               <w:left w:val="single" w:color="000000" w:sz="4" w:space="0" w:shadow="0" w:frame="0"/>
@@ -1633,7 +1492,7 @@
           <w:shd w:val="clear" w:color="auto" w:fill="ced7e7"/>
         </w:tblPrEx>
         <w:trPr>
-          <w:trHeight w:val="310" w:hRule="atLeast"/>
+          <w:trHeight w:val="320" w:hRule="atLeast"/>
         </w:trPr>
         <w:tc>
           <w:tcPr>
@@ -1742,7 +1601,7 @@
         </w:tc>
         <w:tc>
           <w:tcPr>
-            <w:tcW w:type="dxa" w:w="2580"/>
+            <w:tcW w:type="dxa" w:w="2581"/>
             <w:tcBorders>
               <w:top w:val="single" w:color="000000" w:sz="4" w:space="0" w:shadow="0" w:frame="0"/>
               <w:left w:val="single" w:color="000000" w:sz="4" w:space="0" w:shadow="0" w:frame="0"/>
@@ -1825,7 +1684,7 @@
           <w:shd w:val="clear" w:color="auto" w:fill="ced7e7"/>
         </w:tblPrEx>
         <w:trPr>
-          <w:trHeight w:val="310" w:hRule="atLeast"/>
+          <w:trHeight w:val="320" w:hRule="atLeast"/>
         </w:trPr>
         <w:tc>
           <w:tcPr>
@@ -1934,7 +1793,7 @@
         </w:tc>
         <w:tc>
           <w:tcPr>
-            <w:tcW w:type="dxa" w:w="2580"/>
+            <w:tcW w:type="dxa" w:w="2581"/>
             <w:tcBorders>
               <w:top w:val="single" w:color="000000" w:sz="4" w:space="0" w:shadow="0" w:frame="0"/>
               <w:left w:val="single" w:color="000000" w:sz="4" w:space="0" w:shadow="0" w:frame="0"/>
@@ -2017,7 +1876,7 @@
           <w:shd w:val="clear" w:color="auto" w:fill="ced7e7"/>
         </w:tblPrEx>
         <w:trPr>
-          <w:trHeight w:val="310" w:hRule="atLeast"/>
+          <w:trHeight w:val="320" w:hRule="atLeast"/>
         </w:trPr>
         <w:tc>
           <w:tcPr>
@@ -2126,7 +1985,7 @@
         </w:tc>
         <w:tc>
           <w:tcPr>
-            <w:tcW w:type="dxa" w:w="2580"/>
+            <w:tcW w:type="dxa" w:w="2581"/>
             <w:tcBorders>
               <w:top w:val="single" w:color="000000" w:sz="4" w:space="0" w:shadow="0" w:frame="0"/>
               <w:left w:val="single" w:color="000000" w:sz="4" w:space="0" w:shadow="0" w:frame="0"/>
@@ -2209,7 +2068,7 @@
           <w:shd w:val="clear" w:color="auto" w:fill="ced7e7"/>
         </w:tblPrEx>
         <w:trPr>
-          <w:trHeight w:val="310" w:hRule="atLeast"/>
+          <w:trHeight w:val="320" w:hRule="atLeast"/>
         </w:trPr>
         <w:tc>
           <w:tcPr>
@@ -2318,7 +2177,7 @@
         </w:tc>
         <w:tc>
           <w:tcPr>
-            <w:tcW w:type="dxa" w:w="2580"/>
+            <w:tcW w:type="dxa" w:w="2581"/>
             <w:tcBorders>
               <w:top w:val="single" w:color="000000" w:sz="4" w:space="0" w:shadow="0" w:frame="0"/>
               <w:left w:val="single" w:color="000000" w:sz="4" w:space="0" w:shadow="0" w:frame="0"/>
@@ -2401,7 +2260,7 @@
           <w:shd w:val="clear" w:color="auto" w:fill="ced7e7"/>
         </w:tblPrEx>
         <w:trPr>
-          <w:trHeight w:val="310" w:hRule="atLeast"/>
+          <w:trHeight w:val="320" w:hRule="atLeast"/>
         </w:trPr>
         <w:tc>
           <w:tcPr>
@@ -2510,7 +2369,7 @@
         </w:tc>
         <w:tc>
           <w:tcPr>
-            <w:tcW w:type="dxa" w:w="2580"/>
+            <w:tcW w:type="dxa" w:w="2581"/>
             <w:tcBorders>
               <w:top w:val="single" w:color="000000" w:sz="4" w:space="0" w:shadow="0" w:frame="0"/>
               <w:left w:val="single" w:color="000000" w:sz="4" w:space="0" w:shadow="0" w:frame="0"/>
@@ -2593,7 +2452,7 @@
           <w:shd w:val="clear" w:color="auto" w:fill="ced7e7"/>
         </w:tblPrEx>
         <w:trPr>
-          <w:trHeight w:val="310" w:hRule="atLeast"/>
+          <w:trHeight w:val="320" w:hRule="atLeast"/>
         </w:trPr>
         <w:tc>
           <w:tcPr>
@@ -2702,7 +2561,7 @@
         </w:tc>
         <w:tc>
           <w:tcPr>
-            <w:tcW w:type="dxa" w:w="2580"/>
+            <w:tcW w:type="dxa" w:w="2581"/>
             <w:tcBorders>
               <w:top w:val="single" w:color="000000" w:sz="4" w:space="0" w:shadow="0" w:frame="0"/>
               <w:left w:val="single" w:color="000000" w:sz="4" w:space="0" w:shadow="0" w:frame="0"/>
@@ -2785,7 +2644,7 @@
           <w:shd w:val="clear" w:color="auto" w:fill="ced7e7"/>
         </w:tblPrEx>
         <w:trPr>
-          <w:trHeight w:val="310" w:hRule="atLeast"/>
+          <w:trHeight w:val="320" w:hRule="atLeast"/>
         </w:trPr>
         <w:tc>
           <w:tcPr>
@@ -2894,7 +2753,7 @@
         </w:tc>
         <w:tc>
           <w:tcPr>
-            <w:tcW w:type="dxa" w:w="2580"/>
+            <w:tcW w:type="dxa" w:w="2581"/>
             <w:tcBorders>
               <w:top w:val="single" w:color="000000" w:sz="4" w:space="0" w:shadow="0" w:frame="0"/>
               <w:left w:val="single" w:color="000000" w:sz="4" w:space="0" w:shadow="0" w:frame="0"/>
@@ -2977,7 +2836,7 @@
           <w:shd w:val="clear" w:color="auto" w:fill="ced7e7"/>
         </w:tblPrEx>
         <w:trPr>
-          <w:trHeight w:val="310" w:hRule="atLeast"/>
+          <w:trHeight w:val="320" w:hRule="atLeast"/>
         </w:trPr>
         <w:tc>
           <w:tcPr>
@@ -3086,7 +2945,7 @@
         </w:tc>
         <w:tc>
           <w:tcPr>
-            <w:tcW w:type="dxa" w:w="2580"/>
+            <w:tcW w:type="dxa" w:w="2581"/>
             <w:tcBorders>
               <w:top w:val="single" w:color="000000" w:sz="4" w:space="0" w:shadow="0" w:frame="0"/>
               <w:left w:val="single" w:color="000000" w:sz="4" w:space="0" w:shadow="0" w:frame="0"/>
@@ -3169,7 +3028,7 @@
           <w:shd w:val="clear" w:color="auto" w:fill="ced7e7"/>
         </w:tblPrEx>
         <w:trPr>
-          <w:trHeight w:val="310" w:hRule="atLeast"/>
+          <w:trHeight w:val="320" w:hRule="atLeast"/>
         </w:trPr>
         <w:tc>
           <w:tcPr>
@@ -3278,7 +3137,7 @@
         </w:tc>
         <w:tc>
           <w:tcPr>
-            <w:tcW w:type="dxa" w:w="2580"/>
+            <w:tcW w:type="dxa" w:w="2581"/>
             <w:tcBorders>
               <w:top w:val="single" w:color="000000" w:sz="4" w:space="0" w:shadow="0" w:frame="0"/>
               <w:left w:val="single" w:color="000000" w:sz="4" w:space="0" w:shadow="0" w:frame="0"/>
@@ -3361,7 +3220,7 @@
           <w:shd w:val="clear" w:color="auto" w:fill="ced7e7"/>
         </w:tblPrEx>
         <w:trPr>
-          <w:trHeight w:val="310" w:hRule="atLeast"/>
+          <w:trHeight w:val="320" w:hRule="atLeast"/>
         </w:trPr>
         <w:tc>
           <w:tcPr>
@@ -3470,7 +3329,7 @@
         </w:tc>
         <w:tc>
           <w:tcPr>
-            <w:tcW w:type="dxa" w:w="2580"/>
+            <w:tcW w:type="dxa" w:w="2581"/>
             <w:tcBorders>
               <w:top w:val="single" w:color="000000" w:sz="4" w:space="0" w:shadow="0" w:frame="0"/>
               <w:left w:val="single" w:color="000000" w:sz="4" w:space="0" w:shadow="0" w:frame="0"/>
@@ -3553,7 +3412,7 @@
           <w:shd w:val="clear" w:color="auto" w:fill="ced7e7"/>
         </w:tblPrEx>
         <w:trPr>
-          <w:trHeight w:val="310" w:hRule="atLeast"/>
+          <w:trHeight w:val="320" w:hRule="atLeast"/>
         </w:trPr>
         <w:tc>
           <w:tcPr>
@@ -3662,7 +3521,7 @@
         </w:tc>
         <w:tc>
           <w:tcPr>
-            <w:tcW w:type="dxa" w:w="2580"/>
+            <w:tcW w:type="dxa" w:w="2581"/>
             <w:tcBorders>
               <w:top w:val="single" w:color="000000" w:sz="4" w:space="0" w:shadow="0" w:frame="0"/>
               <w:left w:val="single" w:color="000000" w:sz="4" w:space="0" w:shadow="0" w:frame="0"/>
@@ -3745,7 +3604,7 @@
           <w:shd w:val="clear" w:color="auto" w:fill="ced7e7"/>
         </w:tblPrEx>
         <w:trPr>
-          <w:trHeight w:val="310" w:hRule="atLeast"/>
+          <w:trHeight w:val="320" w:hRule="atLeast"/>
         </w:trPr>
         <w:tc>
           <w:tcPr>
@@ -3854,7 +3713,7 @@
         </w:tc>
         <w:tc>
           <w:tcPr>
-            <w:tcW w:type="dxa" w:w="2580"/>
+            <w:tcW w:type="dxa" w:w="2581"/>
             <w:tcBorders>
               <w:top w:val="single" w:color="000000" w:sz="4" w:space="0" w:shadow="0" w:frame="0"/>
               <w:left w:val="single" w:color="000000" w:sz="4" w:space="0" w:shadow="0" w:frame="0"/>
@@ -3937,7 +3796,7 @@
           <w:shd w:val="clear" w:color="auto" w:fill="ced7e7"/>
         </w:tblPrEx>
         <w:trPr>
-          <w:trHeight w:val="310" w:hRule="atLeast"/>
+          <w:trHeight w:val="320" w:hRule="atLeast"/>
         </w:trPr>
         <w:tc>
           <w:tcPr>
@@ -4046,7 +3905,7 @@
         </w:tc>
         <w:tc>
           <w:tcPr>
-            <w:tcW w:type="dxa" w:w="2580"/>
+            <w:tcW w:type="dxa" w:w="2581"/>
             <w:tcBorders>
               <w:top w:val="single" w:color="000000" w:sz="4" w:space="0" w:shadow="0" w:frame="0"/>
               <w:left w:val="single" w:color="000000" w:sz="4" w:space="0" w:shadow="0" w:frame="0"/>
@@ -4129,7 +3988,7 @@
           <w:shd w:val="clear" w:color="auto" w:fill="ced7e7"/>
         </w:tblPrEx>
         <w:trPr>
-          <w:trHeight w:val="310" w:hRule="atLeast"/>
+          <w:trHeight w:val="320" w:hRule="atLeast"/>
         </w:trPr>
         <w:tc>
           <w:tcPr>
@@ -4238,7 +4097,7 @@
         </w:tc>
         <w:tc>
           <w:tcPr>
-            <w:tcW w:type="dxa" w:w="2580"/>
+            <w:tcW w:type="dxa" w:w="2581"/>
             <w:tcBorders>
               <w:top w:val="single" w:color="000000" w:sz="4" w:space="0" w:shadow="0" w:frame="0"/>
               <w:left w:val="single" w:color="000000" w:sz="4" w:space="0" w:shadow="0" w:frame="0"/>
@@ -4321,7 +4180,7 @@
           <w:shd w:val="clear" w:color="auto" w:fill="ced7e7"/>
         </w:tblPrEx>
         <w:trPr>
-          <w:trHeight w:val="310" w:hRule="atLeast"/>
+          <w:trHeight w:val="320" w:hRule="atLeast"/>
         </w:trPr>
         <w:tc>
           <w:tcPr>
@@ -4430,7 +4289,7 @@
         </w:tc>
         <w:tc>
           <w:tcPr>
-            <w:tcW w:type="dxa" w:w="2580"/>
+            <w:tcW w:type="dxa" w:w="2581"/>
             <w:tcBorders>
               <w:top w:val="single" w:color="000000" w:sz="4" w:space="0" w:shadow="0" w:frame="0"/>
               <w:left w:val="single" w:color="000000" w:sz="4" w:space="0" w:shadow="0" w:frame="0"/>
@@ -4513,7 +4372,7 @@
           <w:shd w:val="clear" w:color="auto" w:fill="ced7e7"/>
         </w:tblPrEx>
         <w:trPr>
-          <w:trHeight w:val="310" w:hRule="atLeast"/>
+          <w:trHeight w:val="320" w:hRule="atLeast"/>
         </w:trPr>
         <w:tc>
           <w:tcPr>
@@ -4622,7 +4481,7 @@
         </w:tc>
         <w:tc>
           <w:tcPr>
-            <w:tcW w:type="dxa" w:w="2580"/>
+            <w:tcW w:type="dxa" w:w="2581"/>
             <w:tcBorders>
               <w:top w:val="single" w:color="000000" w:sz="4" w:space="0" w:shadow="0" w:frame="0"/>
               <w:left w:val="single" w:color="000000" w:sz="4" w:space="0" w:shadow="0" w:frame="0"/>
@@ -4705,7 +4564,7 @@
           <w:shd w:val="clear" w:color="auto" w:fill="ced7e7"/>
         </w:tblPrEx>
         <w:trPr>
-          <w:trHeight w:val="310" w:hRule="atLeast"/>
+          <w:trHeight w:val="320" w:hRule="atLeast"/>
         </w:trPr>
         <w:tc>
           <w:tcPr>
@@ -4814,7 +4673,7 @@
         </w:tc>
         <w:tc>
           <w:tcPr>
-            <w:tcW w:type="dxa" w:w="2580"/>
+            <w:tcW w:type="dxa" w:w="2581"/>
             <w:tcBorders>
               <w:top w:val="single" w:color="000000" w:sz="4" w:space="0" w:shadow="0" w:frame="0"/>
               <w:left w:val="single" w:color="000000" w:sz="4" w:space="0" w:shadow="0" w:frame="0"/>
@@ -4897,7 +4756,7 @@
           <w:shd w:val="clear" w:color="auto" w:fill="ced7e7"/>
         </w:tblPrEx>
         <w:trPr>
-          <w:trHeight w:val="310" w:hRule="atLeast"/>
+          <w:trHeight w:val="320" w:hRule="atLeast"/>
         </w:trPr>
         <w:tc>
           <w:tcPr>
@@ -5006,7 +4865,7 @@
         </w:tc>
         <w:tc>
           <w:tcPr>
-            <w:tcW w:type="dxa" w:w="2580"/>
+            <w:tcW w:type="dxa" w:w="2581"/>
             <w:tcBorders>
               <w:top w:val="single" w:color="000000" w:sz="4" w:space="0" w:shadow="0" w:frame="0"/>
               <w:left w:val="single" w:color="000000" w:sz="4" w:space="0" w:shadow="0" w:frame="0"/>
@@ -5089,7 +4948,7 @@
           <w:shd w:val="clear" w:color="auto" w:fill="ced7e7"/>
         </w:tblPrEx>
         <w:trPr>
-          <w:trHeight w:val="310" w:hRule="atLeast"/>
+          <w:trHeight w:val="320" w:hRule="atLeast"/>
         </w:trPr>
         <w:tc>
           <w:tcPr>
@@ -5198,7 +5057,7 @@
         </w:tc>
         <w:tc>
           <w:tcPr>
-            <w:tcW w:type="dxa" w:w="2580"/>
+            <w:tcW w:type="dxa" w:w="2581"/>
             <w:tcBorders>
               <w:top w:val="single" w:color="000000" w:sz="4" w:space="0" w:shadow="0" w:frame="0"/>
               <w:left w:val="single" w:color="000000" w:sz="4" w:space="0" w:shadow="0" w:frame="0"/>
@@ -5281,7 +5140,7 @@
           <w:shd w:val="clear" w:color="auto" w:fill="ced7e7"/>
         </w:tblPrEx>
         <w:trPr>
-          <w:trHeight w:val="310" w:hRule="atLeast"/>
+          <w:trHeight w:val="320" w:hRule="atLeast"/>
         </w:trPr>
         <w:tc>
           <w:tcPr>
@@ -5390,7 +5249,7 @@
         </w:tc>
         <w:tc>
           <w:tcPr>
-            <w:tcW w:type="dxa" w:w="2580"/>
+            <w:tcW w:type="dxa" w:w="2581"/>
             <w:tcBorders>
               <w:top w:val="single" w:color="000000" w:sz="4" w:space="0" w:shadow="0" w:frame="0"/>
               <w:left w:val="single" w:color="000000" w:sz="4" w:space="0" w:shadow="0" w:frame="0"/>
@@ -5473,7 +5332,7 @@
           <w:shd w:val="clear" w:color="auto" w:fill="ced7e7"/>
         </w:tblPrEx>
         <w:trPr>
-          <w:trHeight w:val="310" w:hRule="atLeast"/>
+          <w:trHeight w:val="320" w:hRule="atLeast"/>
         </w:trPr>
         <w:tc>
           <w:tcPr>
@@ -5582,7 +5441,7 @@
         </w:tc>
         <w:tc>
           <w:tcPr>
-            <w:tcW w:type="dxa" w:w="2580"/>
+            <w:tcW w:type="dxa" w:w="2581"/>
             <w:tcBorders>
               <w:top w:val="single" w:color="000000" w:sz="4" w:space="0" w:shadow="0" w:frame="0"/>
               <w:left w:val="single" w:color="000000" w:sz="4" w:space="0" w:shadow="0" w:frame="0"/>
@@ -5665,7 +5524,7 @@
           <w:shd w:val="clear" w:color="auto" w:fill="ced7e7"/>
         </w:tblPrEx>
         <w:trPr>
-          <w:trHeight w:val="310" w:hRule="atLeast"/>
+          <w:trHeight w:val="320" w:hRule="atLeast"/>
         </w:trPr>
         <w:tc>
           <w:tcPr>
@@ -5774,7 +5633,7 @@
         </w:tc>
         <w:tc>
           <w:tcPr>
-            <w:tcW w:type="dxa" w:w="2580"/>
+            <w:tcW w:type="dxa" w:w="2581"/>
             <w:tcBorders>
               <w:top w:val="single" w:color="000000" w:sz="4" w:space="0" w:shadow="0" w:frame="0"/>
               <w:left w:val="single" w:color="000000" w:sz="4" w:space="0" w:shadow="0" w:frame="0"/>
@@ -5857,7 +5716,7 @@
           <w:shd w:val="clear" w:color="auto" w:fill="ced7e7"/>
         </w:tblPrEx>
         <w:trPr>
-          <w:trHeight w:val="655" w:hRule="atLeast"/>
+          <w:trHeight w:val="665" w:hRule="atLeast"/>
         </w:trPr>
         <w:tc>
           <w:tcPr>
@@ -6025,7 +5884,7 @@
           <w:shd w:val="clear" w:color="auto" w:fill="ced7e7"/>
         </w:tblPrEx>
         <w:trPr>
-          <w:trHeight w:val="310" w:hRule="atLeast"/>
+          <w:trHeight w:val="320" w:hRule="atLeast"/>
         </w:trPr>
         <w:tc>
           <w:tcPr>
@@ -6114,7 +5973,7 @@
           <w:shd w:val="clear" w:color="auto" w:fill="ced7e7"/>
         </w:tblPrEx>
         <w:trPr>
-          <w:trHeight w:val="396" w:hRule="atLeast"/>
+          <w:trHeight w:val="406" w:hRule="atLeast"/>
         </w:trPr>
         <w:tc>
           <w:tcPr>
@@ -6269,6 +6128,18 @@
         </w:tc>
       </w:tr>
     </w:tbl>
+    <w:p>
+      <w:pPr>
+        <w:pStyle w:val="Normal.0"/>
+        <w:ind w:left="108" w:hanging="108"/>
+        <w:jc w:val="center"/>
+        <w:rPr>
+          <w:rFonts w:ascii="宋体" w:cs="宋体" w:hAnsi="宋体" w:eastAsia="宋体"/>
+          <w:sz w:val="24"/>
+          <w:szCs w:val="24"/>
+        </w:rPr>
+      </w:pPr>
+    </w:p>
     <w:p>
       <w:pPr>
         <w:pStyle w:val="Normal.0"/>
@@ -6500,7 +6371,7 @@
       <w:tblPr>
         <w:tblW w:w="9964" w:type="dxa"/>
         <w:jc w:val="center"/>
-        <w:tblInd w:w="108" w:type="dxa"/>
+        <w:tblInd w:w="216" w:type="dxa"/>
         <w:tblBorders>
           <w:top w:val="single" w:color="ffffff" w:sz="8" w:space="0" w:shadow="0" w:frame="0"/>
           <w:left w:val="single" w:color="ffffff" w:sz="8" w:space="0" w:shadow="0" w:frame="0"/>
@@ -6526,7 +6397,7 @@
           <w:shd w:val="clear" w:color="auto" w:fill="ced7e7"/>
         </w:tblPrEx>
         <w:trPr>
-          <w:trHeight w:val="610" w:hRule="atLeast"/>
+          <w:trHeight w:val="620" w:hRule="atLeast"/>
         </w:trPr>
         <w:tc>
           <w:tcPr>
@@ -6774,7 +6645,7 @@
         </w:tc>
         <w:tc>
           <w:tcPr>
-            <w:tcW w:type="dxa" w:w="1559"/>
+            <w:tcW w:type="dxa" w:w="1560"/>
             <w:tcBorders>
               <w:top w:val="single" w:color="000000" w:sz="4" w:space="0" w:shadow="0" w:frame="0"/>
               <w:left w:val="single" w:color="000000" w:sz="4" w:space="0" w:shadow="0" w:frame="0"/>
@@ -6942,7 +6813,7 @@
           <w:shd w:val="clear" w:color="auto" w:fill="ced7e7"/>
         </w:tblPrEx>
         <w:trPr>
-          <w:trHeight w:val="310" w:hRule="atLeast"/>
+          <w:trHeight w:val="320" w:hRule="atLeast"/>
         </w:trPr>
         <w:tc>
           <w:tcPr>
@@ -7084,7 +6955,7 @@
         </w:tc>
         <w:tc>
           <w:tcPr>
-            <w:tcW w:type="dxa" w:w="1559"/>
+            <w:tcW w:type="dxa" w:w="1560"/>
             <w:tcBorders>
               <w:top w:val="single" w:color="000000" w:sz="4" w:space="0" w:shadow="0" w:frame="0"/>
               <w:left w:val="single" w:color="000000" w:sz="4" w:space="0" w:shadow="0" w:frame="0"/>
@@ -7193,7 +7064,7 @@
           <w:shd w:val="clear" w:color="auto" w:fill="ced7e7"/>
         </w:tblPrEx>
         <w:trPr>
-          <w:trHeight w:val="310" w:hRule="atLeast"/>
+          <w:trHeight w:val="320" w:hRule="atLeast"/>
         </w:trPr>
         <w:tc>
           <w:tcPr>
@@ -7335,7 +7206,7 @@
         </w:tc>
         <w:tc>
           <w:tcPr>
-            <w:tcW w:type="dxa" w:w="1559"/>
+            <w:tcW w:type="dxa" w:w="1560"/>
             <w:tcBorders>
               <w:top w:val="single" w:color="000000" w:sz="4" w:space="0" w:shadow="0" w:frame="0"/>
               <w:left w:val="single" w:color="000000" w:sz="4" w:space="0" w:shadow="0" w:frame="0"/>
@@ -7444,7 +7315,7 @@
           <w:shd w:val="clear" w:color="auto" w:fill="ced7e7"/>
         </w:tblPrEx>
         <w:trPr>
-          <w:trHeight w:val="310" w:hRule="atLeast"/>
+          <w:trHeight w:val="320" w:hRule="atLeast"/>
         </w:trPr>
         <w:tc>
           <w:tcPr>
@@ -7586,7 +7457,7 @@
         </w:tc>
         <w:tc>
           <w:tcPr>
-            <w:tcW w:type="dxa" w:w="1559"/>
+            <w:tcW w:type="dxa" w:w="1560"/>
             <w:tcBorders>
               <w:top w:val="single" w:color="000000" w:sz="4" w:space="0" w:shadow="0" w:frame="0"/>
               <w:left w:val="single" w:color="000000" w:sz="4" w:space="0" w:shadow="0" w:frame="0"/>
@@ -7695,7 +7566,7 @@
           <w:shd w:val="clear" w:color="auto" w:fill="ced7e7"/>
         </w:tblPrEx>
         <w:trPr>
-          <w:trHeight w:val="310" w:hRule="atLeast"/>
+          <w:trHeight w:val="320" w:hRule="atLeast"/>
         </w:trPr>
         <w:tc>
           <w:tcPr>
@@ -7837,7 +7708,7 @@
         </w:tc>
         <w:tc>
           <w:tcPr>
-            <w:tcW w:type="dxa" w:w="1559"/>
+            <w:tcW w:type="dxa" w:w="1560"/>
             <w:tcBorders>
               <w:top w:val="single" w:color="000000" w:sz="4" w:space="0" w:shadow="0" w:frame="0"/>
               <w:left w:val="single" w:color="000000" w:sz="4" w:space="0" w:shadow="0" w:frame="0"/>
@@ -7946,7 +7817,7 @@
           <w:shd w:val="clear" w:color="auto" w:fill="ced7e7"/>
         </w:tblPrEx>
         <w:trPr>
-          <w:trHeight w:val="310" w:hRule="atLeast"/>
+          <w:trHeight w:val="320" w:hRule="atLeast"/>
         </w:trPr>
         <w:tc>
           <w:tcPr>
@@ -8088,7 +7959,7 @@
         </w:tc>
         <w:tc>
           <w:tcPr>
-            <w:tcW w:type="dxa" w:w="1559"/>
+            <w:tcW w:type="dxa" w:w="1560"/>
             <w:tcBorders>
               <w:top w:val="single" w:color="000000" w:sz="4" w:space="0" w:shadow="0" w:frame="0"/>
               <w:left w:val="single" w:color="000000" w:sz="4" w:space="0" w:shadow="0" w:frame="0"/>
@@ -8197,7 +8068,7 @@
           <w:shd w:val="clear" w:color="auto" w:fill="ced7e7"/>
         </w:tblPrEx>
         <w:trPr>
-          <w:trHeight w:val="469" w:hRule="atLeast"/>
+          <w:trHeight w:val="479" w:hRule="atLeast"/>
         </w:trPr>
         <w:tc>
           <w:tcPr>
@@ -8331,6 +8202,18 @@
         </w:tc>
       </w:tr>
     </w:tbl>
+    <w:p>
+      <w:pPr>
+        <w:pStyle w:val="Normal.0"/>
+        <w:ind w:left="108" w:hanging="108"/>
+        <w:jc w:val="center"/>
+        <w:rPr>
+          <w:rFonts w:ascii="宋体" w:cs="宋体" w:hAnsi="宋体" w:eastAsia="宋体"/>
+          <w:sz w:val="24"/>
+          <w:szCs w:val="24"/>
+        </w:rPr>
+      </w:pPr>
+    </w:p>
     <w:p>
       <w:pPr>
         <w:pStyle w:val="Normal.0"/>
@@ -8580,7 +8463,7 @@
       <w:tblPr>
         <w:tblW w:w="9739" w:type="dxa"/>
         <w:jc w:val="center"/>
-        <w:tblInd w:w="108" w:type="dxa"/>
+        <w:tblInd w:w="216" w:type="dxa"/>
         <w:tblBorders>
           <w:top w:val="single" w:color="ffffff" w:sz="8" w:space="0" w:shadow="0" w:frame="0"/>
           <w:left w:val="single" w:color="ffffff" w:sz="8" w:space="0" w:shadow="0" w:frame="0"/>
@@ -8604,7 +8487,7 @@
           <w:shd w:val="clear" w:color="auto" w:fill="ced7e7"/>
         </w:tblPrEx>
         <w:trPr>
-          <w:trHeight w:val="610" w:hRule="atLeast"/>
+          <w:trHeight w:val="620" w:hRule="atLeast"/>
         </w:trPr>
         <w:tc>
           <w:tcPr>
@@ -8680,7 +8563,7 @@
         </w:tc>
         <w:tc>
           <w:tcPr>
-            <w:tcW w:type="dxa" w:w="1091"/>
+            <w:tcW w:type="dxa" w:w="1092"/>
             <w:tcBorders>
               <w:top w:val="single" w:color="000000" w:sz="4" w:space="0" w:shadow="0" w:frame="0"/>
               <w:left w:val="single" w:color="000000" w:sz="4" w:space="0" w:shadow="0" w:frame="0"/>
@@ -8836,7 +8719,7 @@
           <w:shd w:val="clear" w:color="auto" w:fill="ced7e7"/>
         </w:tblPrEx>
         <w:trPr>
-          <w:trHeight w:val="1690" w:hRule="atLeast"/>
+          <w:trHeight w:val="1700" w:hRule="atLeast"/>
         </w:trPr>
         <w:tc>
           <w:tcPr>
@@ -8895,7 +8778,7 @@
         </w:tc>
         <w:tc>
           <w:tcPr>
-            <w:tcW w:type="dxa" w:w="1091"/>
+            <w:tcW w:type="dxa" w:w="1092"/>
             <w:tcBorders>
               <w:top w:val="single" w:color="000000" w:sz="4" w:space="0" w:shadow="0" w:frame="0"/>
               <w:left w:val="single" w:color="000000" w:sz="4" w:space="0" w:shadow="0" w:frame="0"/>
@@ -9038,7 +8921,7 @@
           <w:shd w:val="clear" w:color="auto" w:fill="ced7e7"/>
         </w:tblPrEx>
         <w:trPr>
-          <w:trHeight w:val="845" w:hRule="atLeast"/>
+          <w:trHeight w:val="855" w:hRule="atLeast"/>
         </w:trPr>
         <w:tc>
           <w:tcPr>
@@ -9090,7 +8973,7 @@
         </w:tc>
         <w:tc>
           <w:tcPr>
-            <w:tcW w:type="dxa" w:w="1091"/>
+            <w:tcW w:type="dxa" w:w="1092"/>
             <w:tcBorders>
               <w:top w:val="single" w:color="000000" w:sz="4" w:space="0" w:shadow="0" w:frame="0"/>
               <w:left w:val="single" w:color="000000" w:sz="4" w:space="0" w:shadow="0" w:frame="0"/>
@@ -9233,7 +9116,7 @@
           <w:shd w:val="clear" w:color="auto" w:fill="ced7e7"/>
         </w:tblPrEx>
         <w:trPr>
-          <w:trHeight w:val="442" w:hRule="atLeast"/>
+          <w:trHeight w:val="452" w:hRule="atLeast"/>
         </w:trPr>
         <w:tc>
           <w:tcPr>
@@ -9332,6 +9215,18 @@
         </w:tc>
       </w:tr>
     </w:tbl>
+    <w:p>
+      <w:pPr>
+        <w:pStyle w:val="Normal.0"/>
+        <w:ind w:left="108" w:hanging="108"/>
+        <w:jc w:val="center"/>
+        <w:rPr>
+          <w:rFonts w:ascii="宋体" w:cs="宋体" w:hAnsi="宋体" w:eastAsia="宋体"/>
+          <w:sz w:val="24"/>
+          <w:szCs w:val="24"/>
+        </w:rPr>
+      </w:pPr>
+    </w:p>
     <w:p>
       <w:pPr>
         <w:pStyle w:val="Normal.0"/>
@@ -9501,27 +9396,7 @@
           <w:rtl w:val="0"/>
           <w:lang w:val="zh-TW" w:eastAsia="zh-TW"/>
         </w:rPr>
-        <w:t>以上为</w:t>
-      </w:r>
-      <w:r>
-        <w:rPr>
-          <w:rFonts w:ascii="宋体" w:cs="宋体" w:hAnsi="宋体" w:eastAsia="宋体"/>
-          <w:sz w:val="24"/>
-          <w:szCs w:val="24"/>
-          <w:rtl w:val="0"/>
-          <w:lang w:val="en-US"/>
-        </w:rPr>
-        <w:t>“”</w:t>
-      </w:r>
-      <w:r>
-        <w:rPr>
-          <w:rFonts w:ascii="宋体" w:cs="宋体" w:hAnsi="宋体" w:eastAsia="宋体"/>
-          <w:sz w:val="24"/>
-          <w:szCs w:val="24"/>
-          <w:rtl w:val="0"/>
-          <w:lang w:val="zh-TW" w:eastAsia="zh-TW"/>
-        </w:rPr>
-        <w:t>海外商标注册报价方案，若贵司有任何不明之处，欢迎随时与我所联系，我们将竭诚为贵司提供专业的策略支持与高效的申请服务，助力贵司的品牌顺利出海，行稳致远。</w:t>
+        <w:t>以上为我司提供的海外商标注册报价方案，若贵司有任何不明之处，欢迎随时与我所联系，我们将竭诚为贵司提供专业的策略支持与高效的申请服务，助力贵司的品牌顺利出海，行稳致远。</w:t>
       </w:r>
     </w:p>
     <w:p>
@@ -9615,7 +9490,17 @@
           <w:rtl w:val="0"/>
           <w:lang w:val="zh-TW" w:eastAsia="zh-TW"/>
         </w:rPr>
-        <w:t>联系人：何奇</w:t>
+        <w:t>联系人：</w:t>
+      </w:r>
+      <w:r>
+        <w:rPr>
+          <w:rFonts w:ascii="宋体" w:cs="宋体" w:hAnsi="宋体" w:eastAsia="宋体"/>
+          <w:sz w:val="24"/>
+          <w:szCs w:val="24"/>
+          <w:rtl w:val="0"/>
+          <w:lang w:val="zh-TW" w:eastAsia="zh-TW"/>
+        </w:rPr>
+        <w:t>XX</w:t>
       </w:r>
     </w:p>
     <w:p>
@@ -10943,11 +10828,6 @@
         </w:rPr>
         <w:t>地区不一定能接受，后续可能会引起驳回；或者可选择规范的相近的项目）。</w:t>
       </w:r>
-      <w:r>
-        <w:rPr>
-          <w:rFonts w:ascii="宋体" w:cs="宋体" w:hAnsi="宋体" w:eastAsia="宋体"/>
-        </w:rPr>
-      </w:r>
     </w:p>
     <w:sectPr>
       <w:headerReference w:type="default" r:id="rId5"/>
@@ -10965,16 +10845,11 @@
   <w:p>
     <w:pPr>
       <w:pStyle w:val="header"/>
-      <w:bidi w:val="0"/>
-      <w:ind w:left="0" w:right="0" w:firstLine="0"/>
-      <w:jc w:val="both"/>
       <w:rPr>
         <w:rFonts w:ascii="Calibri" w:cs="Calibri" w:hAnsi="Calibri" w:eastAsia="Calibri"/>
         <w:b w:val="1"/>
         <w:bCs w:val="1"/>
         <w:shd w:val="nil" w:color="auto" w:fill="auto"/>
-        <w:rtl w:val="0"/>
-        <w:lang w:val="en-US"/>
       </w:rPr>
     </w:pPr>
     <w:r>
@@ -10982,12 +10857,13 @@
         <w:rFonts w:ascii="Calibri" w:hAnsi="Calibri"/>
         <w:b w:val="1"/>
         <w:bCs w:val="1"/>
+        <w:lang w:val="en-US"/>
       </w:rPr>
       <w:tab/>
     </w:r>
     <w:r>
       <w:rPr>
-        <w:rFonts w:ascii="Cambria Bold" w:hAnsi="Cambria Bold"/>
+        <w:rFonts w:ascii="Cambria" w:hAnsi="Cambria"/>
         <w:shd w:val="nil" w:color="auto" w:fill="auto"/>
         <w:rtl w:val="0"/>
         <w:lang w:val="zh-TW" w:eastAsia="zh-TW"/>
@@ -11048,12 +10924,6 @@
   <w:p>
     <w:pPr>
       <w:pStyle w:val="header"/>
-      <w:bidi w:val="0"/>
-      <w:ind w:left="0" w:right="0" w:firstLine="0"/>
-      <w:jc w:val="both"/>
-      <w:rPr>
-        <w:rtl w:val="0"/>
-      </w:rPr>
     </w:pPr>
     <w:r>
       <w:rPr>
@@ -11061,7 +10931,6 @@
         <w:b w:val="1"/>
         <w:bCs w:val="1"/>
         <w:shd w:val="nil" w:color="auto" w:fill="auto"/>
-        <w:lang w:val="en-US"/>
       </w:rPr>
       <w:tab/>
       <w:tab/>
@@ -11084,7 +10953,7 @@
             <wp:posOffset>598170</wp:posOffset>
           </wp:positionH>
           <wp:positionV relativeFrom="page">
-            <wp:posOffset>43814</wp:posOffset>
+            <wp:posOffset>43813</wp:posOffset>
           </wp:positionV>
           <wp:extent cx="6374130" cy="794385"/>
           <wp:effectExtent l="0" t="0" r="0" b="0"/>
@@ -11578,6 +11447,9 @@
       <w:shd w:val="nil" w:color="auto" w:fill="auto"/>
       <w:vertAlign w:val="baseline"/>
       <w:lang w:val="en-US"/>
+      <w14:textOutline>
+        <w14:noFill/>
+      </w14:textOutline>
       <w14:textFill>
         <w14:solidFill>
           <w14:srgbClr w14:val="000000"/>
@@ -11741,9 +11613,9 @@
         </a:effectStyle>
         <a:effectStyle>
           <a:effectLst>
-            <a:outerShdw sx="100000" sy="100000" kx="0" ky="0" algn="b" rotWithShape="0" blurRad="38100" dist="20000" dir="5400000">
+            <a:outerShdw sx="100000" sy="100000" kx="0" ky="0" algn="b" rotWithShape="0" blurRad="38100" dist="23000" dir="5400000">
               <a:srgbClr val="000000">
-                <a:alpha val="38000"/>
+                <a:alpha val="35000"/>
               </a:srgbClr>
             </a:outerShdw>
           </a:effectLst>
@@ -11823,7 +11695,7 @@
         </a:effectLst>
         <a:sp3d/>
       </a:spPr>
-      <a:bodyPr rot="0" spcFirstLastPara="1" vertOverflow="overflow" horzOverflow="overflow" vert="horz" wrap="square" lIns="45719" tIns="45719" rIns="45719" bIns="45719" numCol="1" spcCol="38100" rtlCol="0" anchor="ctr" upright="0">
+      <a:bodyPr rot="0" spcFirstLastPara="1" vertOverflow="overflow" horzOverflow="overflow" vert="horz" wrap="square" lIns="45718" tIns="45718" rIns="45718" bIns="45718" numCol="1" spcCol="38100" rtlCol="0" anchor="ctr" upright="0">
         <a:spAutoFit/>
       </a:bodyPr>
       <a:lstStyle>
@@ -11851,10 +11723,10 @@
             </a:solidFill>
             <a:effectLst/>
             <a:uFillTx/>
-            <a:latin typeface="Calibri"/>
-            <a:ea typeface="Calibri"/>
-            <a:cs typeface="Calibri"/>
-            <a:sym typeface="Calibri"/>
+            <a:latin typeface="+mn-lt"/>
+            <a:ea typeface="+mn-ea"/>
+            <a:cs typeface="+mn-cs"/>
+            <a:sym typeface="Helvetica Neue"/>
           </a:defRPr>
         </a:defPPr>
         <a:lvl1pPr marL="0" marR="0" indent="0" algn="l" defTabSz="914400" rtl="0" fontAlgn="auto" latinLnBrk="1" hangingPunct="0">
@@ -12110,9 +11982,9 @@
           <a:round/>
         </a:ln>
         <a:effectLst>
-          <a:outerShdw sx="100000" sy="100000" kx="0" ky="0" algn="b" rotWithShape="0" blurRad="38100" dist="20000" dir="5400000">
+          <a:outerShdw sx="100000" sy="100000" kx="0" ky="0" algn="b" rotWithShape="0" blurRad="38100" dist="23000" dir="5400000">
             <a:srgbClr val="000000">
-              <a:alpha val="38000"/>
+              <a:alpha val="35000"/>
             </a:srgbClr>
           </a:outerShdw>
         </a:effectLst>
@@ -12400,7 +12272,7 @@
         <a:effectLst/>
         <a:sp3d/>
       </a:spPr>
-      <a:bodyPr rot="0" spcFirstLastPara="1" vertOverflow="overflow" horzOverflow="overflow" vert="horz" wrap="square" lIns="45719" tIns="45719" rIns="45719" bIns="45719" numCol="1" spcCol="38100" rtlCol="0" anchor="t" upright="0">
+      <a:bodyPr rot="0" spcFirstLastPara="1" vertOverflow="overflow" horzOverflow="overflow" vert="horz" wrap="square" lIns="45718" tIns="45718" rIns="45718" bIns="45718" numCol="1" spcCol="38100" rtlCol="0" anchor="t" upright="0">
         <a:spAutoFit/>
       </a:bodyPr>
       <a:lstStyle>
@@ -12428,10 +12300,10 @@
             </a:solidFill>
             <a:effectLst/>
             <a:uFillTx/>
-            <a:latin typeface="Calibri"/>
-            <a:ea typeface="Calibri"/>
-            <a:cs typeface="Calibri"/>
-            <a:sym typeface="Calibri"/>
+            <a:latin typeface="+mn-lt"/>
+            <a:ea typeface="+mn-ea"/>
+            <a:cs typeface="+mn-cs"/>
+            <a:sym typeface="Helvetica Neue"/>
           </a:defRPr>
         </a:defPPr>
         <a:lvl1pPr marL="0" marR="0" indent="0" algn="l" defTabSz="914400" rtl="0" fontAlgn="auto" latinLnBrk="1" hangingPunct="0">

</xml_diff>